<commit_message>
Add optimized hash function and config parameters
</commit_message>
<xml_diff>
--- a/Documentation/Study and Evaluation of Sharding in Distributed Databases.docx
+++ b/Documentation/Study and Evaluation of Sharding in Distributed Databases.docx
@@ -2735,7 +2735,6 @@
         <w:t xml:space="preserve">, round-trip </w:t>
       </w:r>
       <w:proofErr w:type="spellStart"/>
-      <w:proofErr w:type="gramStart"/>
       <w:r>
         <w:rPr>
           <w:rFonts w:ascii="Calibri" w:eastAsia="Calibri" w:hAnsi="Calibri" w:cs="Calibri"/>
@@ -2743,7 +2742,6 @@
         <w:t>time;request</w:t>
       </w:r>
       <w:proofErr w:type="spellEnd"/>
-      <w:proofErr w:type="gramEnd"/>
       <w:r>
         <w:rPr>
           <w:rFonts w:ascii="Calibri" w:eastAsia="Calibri" w:hAnsi="Calibri" w:cs="Calibri"/>
@@ -3736,7 +3734,6 @@
         <w:t xml:space="preserve">int </w:t>
       </w:r>
       <w:proofErr w:type="spellStart"/>
-      <w:proofErr w:type="gramStart"/>
       <w:r>
         <w:rPr>
           <w:rFonts w:ascii="CourierNewPSMT" w:cs="CourierNewPSMT"/>
@@ -3756,9 +3753,9 @@
           <w:color w:val="000000" w:themeColor="text1"/>
           <w:highlight w:val="lightGray"/>
         </w:rPr>
-        <w:t>(</w:t>
-      </w:r>
-      <w:proofErr w:type="gramEnd"/>
+        <w:t xml:space="preserve">(int key, int </w:t>
+      </w:r>
+      <w:proofErr w:type="spellStart"/>
       <w:r>
         <w:rPr>
           <w:rFonts w:ascii="CourierNewPSMT" w:cs="CourierNewPSMT"/>
@@ -3767,9 +3764,9 @@
           <w:color w:val="000000" w:themeColor="text1"/>
           <w:highlight w:val="lightGray"/>
         </w:rPr>
-        <w:t xml:space="preserve">int key, int </w:t>
-      </w:r>
-      <w:proofErr w:type="spellStart"/>
+        <w:t>num_buckets</w:t>
+      </w:r>
+      <w:proofErr w:type="spellEnd"/>
       <w:r>
         <w:rPr>
           <w:rFonts w:ascii="CourierNewPSMT" w:cs="CourierNewPSMT"/>
@@ -3778,10 +3775,16 @@
           <w:color w:val="000000" w:themeColor="text1"/>
           <w:highlight w:val="lightGray"/>
         </w:rPr>
-        <w:t>num_buckets</w:t>
-      </w:r>
-      <w:proofErr w:type="spellEnd"/>
-      <w:r>
+        <w:t>) {</w:t>
+      </w:r>
+    </w:p>
+    <w:p>
+      <w:pPr>
+        <w:autoSpaceDE w:val="0"/>
+        <w:autoSpaceDN w:val="0"/>
+        <w:adjustRightInd w:val="0"/>
+        <w:spacing w:after="0" w:line="240" w:lineRule="auto"/>
+        <w:ind w:firstLine="720"/>
         <w:rPr>
           <w:rFonts w:ascii="CourierNewPSMT" w:cs="CourierNewPSMT"/>
           <w:b/>
@@ -3789,7 +3792,38 @@
           <w:color w:val="000000" w:themeColor="text1"/>
           <w:highlight w:val="lightGray"/>
         </w:rPr>
-        <w:t>) {</w:t>
+      </w:pPr>
+      <w:proofErr w:type="spellStart"/>
+      <w:r>
+        <w:rPr>
+          <w:rFonts w:ascii="CourierNewPSMT" w:cs="CourierNewPSMT"/>
+          <w:b/>
+          <w:bCs/>
+          <w:color w:val="000000" w:themeColor="text1"/>
+          <w:highlight w:val="lightGray"/>
+        </w:rPr>
+        <w:t>random.seed</w:t>
+      </w:r>
+      <w:proofErr w:type="spellEnd"/>
+      <w:r>
+        <w:rPr>
+          <w:rFonts w:ascii="CourierNewPSMT" w:cs="CourierNewPSMT"/>
+          <w:b/>
+          <w:bCs/>
+          <w:color w:val="000000" w:themeColor="text1"/>
+          <w:highlight w:val="lightGray"/>
+        </w:rPr>
+        <w:t>(key)</w:t>
+      </w:r>
+      <w:r>
+        <w:rPr>
+          <w:rFonts w:ascii="CourierNewPSMT" w:cs="CourierNewPSMT" w:hint="cs"/>
+          <w:b/>
+          <w:bCs/>
+          <w:color w:val="000000" w:themeColor="text1"/>
+          <w:highlight w:val="lightGray"/>
+        </w:rPr>
+        <w:t>;</w:t>
       </w:r>
     </w:p>
     <w:p>
@@ -3807,8 +3841,6 @@
           <w:highlight w:val="lightGray"/>
         </w:rPr>
       </w:pPr>
-      <w:proofErr w:type="spellStart"/>
-      <w:proofErr w:type="gramStart"/>
       <w:r>
         <w:rPr>
           <w:rFonts w:ascii="CourierNewPSMT" w:cs="CourierNewPSMT"/>
@@ -3817,11 +3849,26 @@
           <w:color w:val="000000" w:themeColor="text1"/>
           <w:highlight w:val="lightGray"/>
         </w:rPr>
-        <w:t>random.seed</w:t>
-      </w:r>
-      <w:proofErr w:type="spellEnd"/>
-      <w:proofErr w:type="gramEnd"/>
-      <w:r>
+        <w:t>int b = 1</w:t>
+      </w:r>
+      <w:r>
+        <w:rPr>
+          <w:rFonts w:ascii="CourierNewPSMT" w:cs="CourierNewPSMT" w:hint="cs"/>
+          <w:b/>
+          <w:bCs/>
+          <w:color w:val="000000" w:themeColor="text1"/>
+          <w:highlight w:val="lightGray"/>
+        </w:rPr>
+        <w:t>;</w:t>
+      </w:r>
+    </w:p>
+    <w:p>
+      <w:pPr>
+        <w:autoSpaceDE w:val="0"/>
+        <w:autoSpaceDN w:val="0"/>
+        <w:adjustRightInd w:val="0"/>
+        <w:spacing w:after="0" w:line="240" w:lineRule="auto"/>
+        <w:ind w:firstLine="720"/>
         <w:rPr>
           <w:rFonts w:ascii="CourierNewPSMT" w:cs="CourierNewPSMT"/>
           <w:b/>
@@ -3829,7 +3876,42 @@
           <w:color w:val="000000" w:themeColor="text1"/>
           <w:highlight w:val="lightGray"/>
         </w:rPr>
-        <w:t>(key)</w:t>
+      </w:pPr>
+      <w:r>
+        <w:rPr>
+          <w:rFonts w:ascii="CourierNewPSMT" w:cs="CourierNewPSMT"/>
+          <w:b/>
+          <w:bCs/>
+          <w:color w:val="000000" w:themeColor="text1"/>
+          <w:highlight w:val="lightGray"/>
+        </w:rPr>
+        <w:t>// bucket number before the previous jump</w:t>
+      </w:r>
+    </w:p>
+    <w:p>
+      <w:pPr>
+        <w:autoSpaceDE w:val="0"/>
+        <w:autoSpaceDN w:val="0"/>
+        <w:adjustRightInd w:val="0"/>
+        <w:spacing w:after="0" w:line="240" w:lineRule="auto"/>
+        <w:ind w:firstLine="720"/>
+        <w:rPr>
+          <w:rFonts w:ascii="CourierNewPSMT" w:cs="CourierNewPSMT"/>
+          <w:b/>
+          <w:bCs/>
+          <w:color w:val="000000" w:themeColor="text1"/>
+          <w:highlight w:val="lightGray"/>
+        </w:rPr>
+      </w:pPr>
+      <w:r>
+        <w:rPr>
+          <w:rFonts w:ascii="CourierNewPSMT" w:cs="CourierNewPSMT"/>
+          <w:b/>
+          <w:bCs/>
+          <w:color w:val="000000" w:themeColor="text1"/>
+          <w:highlight w:val="lightGray"/>
+        </w:rPr>
+        <w:t>int j = 0</w:t>
       </w:r>
       <w:r>
         <w:rPr>
@@ -3841,6 +3923,16 @@
         </w:rPr>
         <w:t>;</w:t>
       </w:r>
+      <w:r>
+        <w:rPr>
+          <w:rFonts w:ascii="CourierNewPSMT" w:cs="CourierNewPSMT"/>
+          <w:b/>
+          <w:bCs/>
+          <w:color w:val="000000" w:themeColor="text1"/>
+          <w:highlight w:val="lightGray"/>
+        </w:rPr>
+        <w:t xml:space="preserve"> // bucket number before the current jump</w:t>
+      </w:r>
     </w:p>
     <w:p>
       <w:pPr>
@@ -3865,7 +3957,55 @@
           <w:color w:val="000000" w:themeColor="text1"/>
           <w:highlight w:val="lightGray"/>
         </w:rPr>
-        <w:t>int b = 1</w:t>
+        <w:t xml:space="preserve">while (j &lt; </w:t>
+      </w:r>
+      <w:proofErr w:type="spellStart"/>
+      <w:r>
+        <w:rPr>
+          <w:rFonts w:ascii="CourierNewPSMT" w:cs="CourierNewPSMT"/>
+          <w:b/>
+          <w:bCs/>
+          <w:color w:val="000000" w:themeColor="text1"/>
+          <w:highlight w:val="lightGray"/>
+        </w:rPr>
+        <w:t>num_buckets</w:t>
+      </w:r>
+      <w:proofErr w:type="spellEnd"/>
+      <w:r>
+        <w:rPr>
+          <w:rFonts w:ascii="CourierNewPSMT" w:cs="CourierNewPSMT"/>
+          <w:b/>
+          <w:bCs/>
+          <w:color w:val="000000" w:themeColor="text1"/>
+          <w:highlight w:val="lightGray"/>
+        </w:rPr>
+        <w:t>) {</w:t>
+      </w:r>
+    </w:p>
+    <w:p>
+      <w:pPr>
+        <w:autoSpaceDE w:val="0"/>
+        <w:autoSpaceDN w:val="0"/>
+        <w:adjustRightInd w:val="0"/>
+        <w:spacing w:after="0" w:line="240" w:lineRule="auto"/>
+        <w:ind w:left="720" w:firstLine="720"/>
+        <w:rPr>
+          <w:rFonts w:ascii="CourierNewPSMT" w:cs="CourierNewPSMT"/>
+          <w:b/>
+          <w:bCs/>
+          <w:color w:val="000000" w:themeColor="text1"/>
+          <w:highlight w:val="lightGray"/>
+        </w:rPr>
+      </w:pPr>
+      <w:r>
+        <w:rPr>
+          <w:rFonts w:ascii="CourierNewPSMT" w:cs="CourierNewPSMT"/>
+          <w:b/>
+          <w:bCs/>
+          <w:color w:val="000000" w:themeColor="text1"/>
+          <w:highlight w:val="lightGray"/>
+        </w:rPr>
+        <w:t>b = j</w:t>
       </w:r>
       <w:r>
         <w:rPr>
@@ -3884,7 +4024,7 @@
         <w:autoSpaceDN w:val="0"/>
         <w:adjustRightInd w:val="0"/>
         <w:spacing w:after="0" w:line="240" w:lineRule="auto"/>
-        <w:ind w:firstLine="720"/>
+        <w:ind w:left="720" w:firstLine="720"/>
         <w:rPr>
           <w:rFonts w:ascii="CourierNewPSMT" w:cs="CourierNewPSMT"/>
           <w:b/>
@@ -3901,7 +4041,75 @@
           <w:color w:val="000000" w:themeColor="text1"/>
           <w:highlight w:val="lightGray"/>
         </w:rPr>
-        <w:t>// bucket number before the previous jump</w:t>
+        <w:t xml:space="preserve">r = </w:t>
+      </w:r>
+      <w:proofErr w:type="spellStart"/>
+      <w:r>
+        <w:rPr>
+          <w:rFonts w:ascii="CourierNewPSMT" w:cs="CourierNewPSMT"/>
+          <w:b/>
+          <w:bCs/>
+          <w:color w:val="000000" w:themeColor="text1"/>
+          <w:highlight w:val="lightGray"/>
+        </w:rPr>
+        <w:t>random.next</w:t>
+      </w:r>
+      <w:proofErr w:type="spellEnd"/>
+      <w:r>
+        <w:rPr>
+          <w:rFonts w:ascii="CourierNewPSMT" w:cs="CourierNewPSMT"/>
+          <w:b/>
+          <w:bCs/>
+          <w:color w:val="000000" w:themeColor="text1"/>
+          <w:highlight w:val="lightGray"/>
+        </w:rPr>
+        <w:t>()</w:t>
+      </w:r>
+      <w:r>
+        <w:rPr>
+          <w:rFonts w:ascii="CourierNewPSMT" w:cs="CourierNewPSMT" w:hint="cs"/>
+          <w:b/>
+          <w:bCs/>
+          <w:color w:val="000000" w:themeColor="text1"/>
+          <w:highlight w:val="lightGray"/>
+        </w:rPr>
+        <w:t>;</w:t>
+      </w:r>
+    </w:p>
+    <w:p>
+      <w:pPr>
+        <w:autoSpaceDE w:val="0"/>
+        <w:autoSpaceDN w:val="0"/>
+        <w:adjustRightInd w:val="0"/>
+        <w:spacing w:after="0" w:line="240" w:lineRule="auto"/>
+        <w:ind w:left="720" w:firstLine="720"/>
+        <w:rPr>
+          <w:rFonts w:ascii="CourierNewPSMT" w:cs="CourierNewPSMT"/>
+          <w:b/>
+          <w:bCs/>
+          <w:color w:val="000000" w:themeColor="text1"/>
+          <w:highlight w:val="lightGray"/>
+        </w:rPr>
+      </w:pPr>
+      <w:r>
+        <w:rPr>
+          <w:rFonts w:ascii="CourierNewPSMT" w:cs="CourierNewPSMT"/>
+          <w:b/>
+          <w:bCs/>
+          <w:color w:val="000000" w:themeColor="text1"/>
+          <w:highlight w:val="lightGray"/>
+        </w:rPr>
+        <w:t>j = floor((b + 1) / r)</w:t>
+      </w:r>
+      <w:r>
+        <w:rPr>
+          <w:rFonts w:ascii="CourierNewPSMT" w:cs="CourierNewPSMT" w:hint="cs"/>
+          <w:b/>
+          <w:bCs/>
+          <w:color w:val="000000" w:themeColor="text1"/>
+          <w:highlight w:val="lightGray"/>
+        </w:rPr>
+        <w:t>;</w:t>
       </w:r>
     </w:p>
     <w:p>
@@ -3927,7 +4135,33 @@
           <w:color w:val="000000" w:themeColor="text1"/>
           <w:highlight w:val="lightGray"/>
         </w:rPr>
-        <w:t>int j = 0</w:t>
+        <w:t>}</w:t>
+      </w:r>
+    </w:p>
+    <w:p>
+      <w:pPr>
+        <w:autoSpaceDE w:val="0"/>
+        <w:autoSpaceDN w:val="0"/>
+        <w:adjustRightInd w:val="0"/>
+        <w:spacing w:after="0" w:line="240" w:lineRule="auto"/>
+        <w:ind w:firstLine="720"/>
+        <w:rPr>
+          <w:rFonts w:ascii="CourierNewPSMT" w:cs="CourierNewPSMT"/>
+          <w:b/>
+          <w:bCs/>
+          <w:color w:val="000000" w:themeColor="text1"/>
+          <w:highlight w:val="lightGray"/>
+        </w:rPr>
+      </w:pPr>
+      <w:r>
+        <w:rPr>
+          <w:rFonts w:ascii="CourierNewPSMT" w:cs="CourierNewPSMT"/>
+          <w:b/>
+          <w:bCs/>
+          <w:color w:val="000000" w:themeColor="text1"/>
+          <w:highlight w:val="lightGray"/>
+        </w:rPr>
+        <w:t>return = b</w:t>
       </w:r>
       <w:r>
         <w:rPr>
@@ -3939,6 +4173,18 @@
         </w:rPr>
         <w:t>;</w:t>
       </w:r>
+    </w:p>
+    <w:p>
+      <w:pPr>
+        <w:pBdr>
+          <w:bottom w:val="single" w:sz="12" w:space="1" w:color="auto"/>
+        </w:pBdr>
+        <w:rPr>
+          <w:b/>
+          <w:bCs/>
+          <w:color w:val="000000" w:themeColor="text1"/>
+        </w:rPr>
+      </w:pPr>
       <w:r>
         <w:rPr>
           <w:rFonts w:ascii="CourierNewPSMT" w:cs="CourierNewPSMT"/>
@@ -3947,327 +4193,278 @@
           <w:color w:val="000000" w:themeColor="text1"/>
           <w:highlight w:val="lightGray"/>
         </w:rPr>
-        <w:t xml:space="preserve"> // bucket number before the current jump</w:t>
-      </w:r>
-    </w:p>
-    <w:p>
-      <w:pPr>
-        <w:autoSpaceDE w:val="0"/>
-        <w:autoSpaceDN w:val="0"/>
-        <w:adjustRightInd w:val="0"/>
-        <w:spacing w:after="0" w:line="240" w:lineRule="auto"/>
-        <w:ind w:firstLine="720"/>
-        <w:rPr>
-          <w:rFonts w:ascii="CourierNewPSMT" w:cs="CourierNewPSMT"/>
+        <w:t>}</w:t>
+      </w:r>
+    </w:p>
+    <w:p/>
+    <w:p>
+      <w:r>
+        <w:t xml:space="preserve">Applications of consistent Hashing : DynamoDB, Cassandra, </w:t>
+      </w:r>
+      <w:proofErr w:type="spellStart"/>
+      <w:r>
+        <w:t>couchbase</w:t>
+      </w:r>
+      <w:proofErr w:type="spellEnd"/>
+      <w:r>
+        <w:t xml:space="preserve">, </w:t>
+      </w:r>
+      <w:proofErr w:type="spellStart"/>
+      <w:r>
+        <w:t>riak</w:t>
+      </w:r>
+      <w:proofErr w:type="spellEnd"/>
+    </w:p>
+    <w:p>
+      <w:pPr>
+        <w:jc w:val="both"/>
+        <w:rPr>
+          <w:rFonts w:cstheme="minorHAnsi"/>
+        </w:rPr>
+      </w:pPr>
+    </w:p>
+    <w:p>
+      <w:pPr>
+        <w:jc w:val="both"/>
+        <w:rPr>
+          <w:rFonts w:cstheme="minorHAnsi"/>
+        </w:rPr>
+      </w:pPr>
+    </w:p>
+    <w:p>
+      <w:pPr>
+        <w:jc w:val="both"/>
+        <w:rPr>
+          <w:rFonts w:cstheme="minorHAnsi"/>
+        </w:rPr>
+      </w:pPr>
+    </w:p>
+    <w:p>
+      <w:pPr>
+        <w:jc w:val="both"/>
+        <w:rPr>
+          <w:rFonts w:cstheme="minorHAnsi"/>
           <w:b/>
           <w:bCs/>
-          <w:color w:val="000000" w:themeColor="text1"/>
-          <w:highlight w:val="lightGray"/>
-        </w:rPr>
-      </w:pPr>
-      <w:r>
-        <w:rPr>
-          <w:rFonts w:ascii="CourierNewPSMT" w:cs="CourierNewPSMT"/>
+        </w:rPr>
+      </w:pPr>
+      <w:r>
+        <w:rPr>
+          <w:rFonts w:cstheme="minorHAnsi"/>
           <w:b/>
           <w:bCs/>
-          <w:color w:val="000000" w:themeColor="text1"/>
-          <w:highlight w:val="lightGray"/>
-        </w:rPr>
-        <w:t xml:space="preserve">while (j &lt; </w:t>
+        </w:rPr>
+        <w:t>Sharding to build distributed database:</w:t>
+      </w:r>
+    </w:p>
+    <w:p>
+      <w:pPr>
+        <w:jc w:val="both"/>
+        <w:rPr>
+          <w:rFonts w:cstheme="minorHAnsi"/>
+        </w:rPr>
+      </w:pPr>
+      <w:r>
+        <w:rPr>
+          <w:rFonts w:cstheme="minorHAnsi"/>
+        </w:rPr>
+        <w:t>Distributed database needs to automatically partition the data and distribute across several database servers, called sites.</w:t>
+      </w:r>
+    </w:p>
+    <w:p>
+      <w:pPr>
+        <w:jc w:val="both"/>
+      </w:pPr>
+      <w:r>
+        <w:t xml:space="preserve">Data sharding helps in scalability and </w:t>
+      </w:r>
+      <w:r>
+        <w:t xml:space="preserve">geo-distribution </w:t>
+      </w:r>
+      <w:r>
+        <w:t>by partitioning data</w:t>
+      </w:r>
+      <w:r>
+        <w:t>, either vertically or horizontally</w:t>
+      </w:r>
+      <w:r>
+        <w:t>.</w:t>
+      </w:r>
+    </w:p>
+    <w:p>
+      <w:pPr>
+        <w:jc w:val="both"/>
+        <w:rPr>
+          <w:rFonts w:cstheme="minorHAnsi"/>
+        </w:rPr>
+      </w:pPr>
+      <w:r>
+        <w:t xml:space="preserve">A SQL table is decomposed into multiple sets of rows according to a specific sharding strategy. Each of these sets of rows is called a </w:t>
       </w:r>
       <w:proofErr w:type="spellStart"/>
       <w:r>
-        <w:rPr>
-          <w:rFonts w:ascii="CourierNewPSMT" w:cs="CourierNewPSMT"/>
-          <w:b/>
-          <w:bCs/>
-          <w:color w:val="000000" w:themeColor="text1"/>
-          <w:highlight w:val="lightGray"/>
-        </w:rPr>
-        <w:t>num_buckets</w:t>
+        <w:t>shard</w:t>
       </w:r>
       <w:proofErr w:type="spellEnd"/>
       <w:r>
-        <w:rPr>
-          <w:rFonts w:ascii="CourierNewPSMT" w:cs="CourierNewPSMT"/>
-          <w:b/>
-          <w:bCs/>
-          <w:color w:val="000000" w:themeColor="text1"/>
-          <w:highlight w:val="lightGray"/>
-        </w:rPr>
-        <w:t>) {</w:t>
-      </w:r>
-    </w:p>
-    <w:p>
-      <w:pPr>
-        <w:autoSpaceDE w:val="0"/>
-        <w:autoSpaceDN w:val="0"/>
-        <w:adjustRightInd w:val="0"/>
-        <w:spacing w:after="0" w:line="240" w:lineRule="auto"/>
-        <w:ind w:left="720" w:firstLine="720"/>
-        <w:rPr>
-          <w:rFonts w:ascii="CourierNewPSMT" w:cs="CourierNewPSMT"/>
-          <w:b/>
-          <w:bCs/>
-          <w:color w:val="000000" w:themeColor="text1"/>
-          <w:highlight w:val="lightGray"/>
-        </w:rPr>
-      </w:pPr>
-      <w:r>
-        <w:rPr>
-          <w:rFonts w:ascii="CourierNewPSMT" w:cs="CourierNewPSMT"/>
-          <w:b/>
-          <w:bCs/>
-          <w:color w:val="000000" w:themeColor="text1"/>
-          <w:highlight w:val="lightGray"/>
-        </w:rPr>
-        <w:t>b = j</w:t>
-      </w:r>
-      <w:r>
-        <w:rPr>
-          <w:rFonts w:ascii="CourierNewPSMT" w:cs="CourierNewPSMT" w:hint="cs"/>
-          <w:b/>
-          <w:bCs/>
-          <w:color w:val="000000" w:themeColor="text1"/>
-          <w:highlight w:val="lightGray"/>
-        </w:rPr>
-        <w:t>;</w:t>
-      </w:r>
-    </w:p>
-    <w:p>
-      <w:pPr>
-        <w:autoSpaceDE w:val="0"/>
-        <w:autoSpaceDN w:val="0"/>
-        <w:adjustRightInd w:val="0"/>
-        <w:spacing w:after="0" w:line="240" w:lineRule="auto"/>
-        <w:ind w:left="720" w:firstLine="720"/>
-        <w:rPr>
-          <w:rFonts w:ascii="CourierNewPSMT" w:cs="CourierNewPSMT"/>
-          <w:b/>
-          <w:bCs/>
-          <w:color w:val="000000" w:themeColor="text1"/>
-          <w:highlight w:val="lightGray"/>
-        </w:rPr>
-      </w:pPr>
-      <w:r>
-        <w:rPr>
-          <w:rFonts w:ascii="CourierNewPSMT" w:cs="CourierNewPSMT"/>
-          <w:b/>
-          <w:bCs/>
-          <w:color w:val="000000" w:themeColor="text1"/>
-          <w:highlight w:val="lightGray"/>
-        </w:rPr>
-        <w:t xml:space="preserve">r = </w:t>
+        <w:t xml:space="preserve">. These shards are distributed across multiple </w:t>
+      </w:r>
+      <w:r>
+        <w:t xml:space="preserve">database </w:t>
+      </w:r>
+      <w:r>
+        <w:t>server</w:t>
+      </w:r>
+      <w:r>
+        <w:t>s</w:t>
+      </w:r>
+      <w:r>
+        <w:t xml:space="preserve"> </w:t>
+      </w:r>
+      <w:r>
+        <w:t>(</w:t>
+      </w:r>
+      <w:r>
+        <w:t>nodes</w:t>
+      </w:r>
+      <w:r>
+        <w:t>/sites)</w:t>
+      </w:r>
+      <w:r>
+        <w:t xml:space="preserve"> in a shared-nothing architecture. This ensures that the shards do not get bottlenecked by the compute, </w:t>
+      </w:r>
+      <w:r>
+        <w:t>storage,</w:t>
+      </w:r>
+      <w:r>
+        <w:t xml:space="preserve"> and networking resources available at a single node. High availability is achieved by replicating each shard across multiple nodes. However, the application interacts with a SQL table as one logical unit and remains agnostic to the physical placement of the shards.</w:t>
+      </w:r>
+    </w:p>
+    <w:p>
+      <w:pPr>
+        <w:jc w:val="both"/>
+      </w:pPr>
+    </w:p>
+    <w:p>
+      <w:pPr>
+        <w:jc w:val="both"/>
+      </w:pPr>
+      <w:r>
+        <w:t>We use a non-relational database, namely a key-value based non-relational database. We shard the data based on the key.</w:t>
+      </w:r>
+    </w:p>
+    <w:p>
+      <w:pPr>
+        <w:jc w:val="both"/>
+      </w:pPr>
+      <w:r>
+        <w:t xml:space="preserve">With consistent hash sharding, data is evenly and randomly distributed across </w:t>
+      </w:r>
+      <w:r>
+        <w:t>sites</w:t>
+      </w:r>
+      <w:r>
+        <w:t xml:space="preserve"> using a partitioning algorithm. Each </w:t>
+      </w:r>
+      <w:r>
+        <w:t>shard is placed into a database server,</w:t>
+      </w:r>
+      <w:r>
+        <w:t xml:space="preserve"> determined by computing a consistent hash on th</w:t>
+      </w:r>
+      <w:r>
+        <w:t>e shard key</w:t>
+      </w:r>
+      <w:r>
+        <w:t>.</w:t>
+      </w:r>
+    </w:p>
+    <w:p>
+      <w:pPr>
+        <w:jc w:val="both"/>
+      </w:pPr>
+    </w:p>
+    <w:p>
+      <w:pPr>
+        <w:jc w:val="both"/>
+      </w:pPr>
+      <w:r>
+        <w:t>Pros:</w:t>
+      </w:r>
+    </w:p>
+    <w:p>
+      <w:pPr>
+        <w:jc w:val="both"/>
+      </w:pPr>
+      <w:r>
+        <w:lastRenderedPageBreak/>
+        <w:t xml:space="preserve">This sharding strategy is ideal for massively scalable workloads because it distributes data evenly across all the </w:t>
+      </w:r>
+      <w:r>
+        <w:t>sites</w:t>
+      </w:r>
+      <w:r>
+        <w:t xml:space="preserve"> in the cluster, while retaining ease of adding </w:t>
+      </w:r>
+      <w:r>
+        <w:t>sites</w:t>
+      </w:r>
+      <w:r>
+        <w:t xml:space="preserve"> into the cluster.</w:t>
+      </w:r>
+      <w:r>
+        <w:t xml:space="preserve"> </w:t>
+      </w:r>
+      <w:r>
+        <w:t xml:space="preserve">With consistent hash sharding, there are many more </w:t>
       </w:r>
       <w:proofErr w:type="spellStart"/>
-      <w:proofErr w:type="gramStart"/>
-      <w:r>
-        <w:rPr>
-          <w:rFonts w:ascii="CourierNewPSMT" w:cs="CourierNewPSMT"/>
-          <w:b/>
-          <w:bCs/>
-          <w:color w:val="000000" w:themeColor="text1"/>
-          <w:highlight w:val="lightGray"/>
-        </w:rPr>
-        <w:t>random.next</w:t>
+      <w:r>
+        <w:t>shards</w:t>
       </w:r>
       <w:proofErr w:type="spellEnd"/>
-      <w:proofErr w:type="gramEnd"/>
-      <w:r>
-        <w:rPr>
-          <w:rFonts w:ascii="CourierNewPSMT" w:cs="CourierNewPSMT"/>
-          <w:b/>
-          <w:bCs/>
-          <w:color w:val="000000" w:themeColor="text1"/>
-          <w:highlight w:val="lightGray"/>
-        </w:rPr>
-        <w:t>()</w:t>
-      </w:r>
-      <w:r>
-        <w:rPr>
-          <w:rFonts w:ascii="CourierNewPSMT" w:cs="CourierNewPSMT" w:hint="cs"/>
-          <w:b/>
-          <w:bCs/>
-          <w:color w:val="000000" w:themeColor="text1"/>
-          <w:highlight w:val="lightGray"/>
-        </w:rPr>
-        <w:t>;</w:t>
-      </w:r>
-    </w:p>
-    <w:p>
-      <w:pPr>
-        <w:autoSpaceDE w:val="0"/>
-        <w:autoSpaceDN w:val="0"/>
-        <w:adjustRightInd w:val="0"/>
-        <w:spacing w:after="0" w:line="240" w:lineRule="auto"/>
-        <w:ind w:left="720" w:firstLine="720"/>
-        <w:rPr>
-          <w:rFonts w:ascii="CourierNewPSMT" w:cs="CourierNewPSMT"/>
-          <w:b/>
-          <w:bCs/>
-          <w:color w:val="000000" w:themeColor="text1"/>
-          <w:highlight w:val="lightGray"/>
-        </w:rPr>
-      </w:pPr>
-      <w:r>
-        <w:rPr>
-          <w:rFonts w:ascii="CourierNewPSMT" w:cs="CourierNewPSMT"/>
-          <w:b/>
-          <w:bCs/>
-          <w:color w:val="000000" w:themeColor="text1"/>
-          <w:highlight w:val="lightGray"/>
-        </w:rPr>
-        <w:t xml:space="preserve">j = </w:t>
-      </w:r>
-      <w:proofErr w:type="gramStart"/>
-      <w:r>
-        <w:rPr>
-          <w:rFonts w:ascii="CourierNewPSMT" w:cs="CourierNewPSMT"/>
-          <w:b/>
-          <w:bCs/>
-          <w:color w:val="000000" w:themeColor="text1"/>
-          <w:highlight w:val="lightGray"/>
-        </w:rPr>
-        <w:t>floor(</w:t>
-      </w:r>
-      <w:proofErr w:type="gramEnd"/>
-      <w:r>
-        <w:rPr>
-          <w:rFonts w:ascii="CourierNewPSMT" w:cs="CourierNewPSMT"/>
-          <w:b/>
-          <w:bCs/>
-          <w:color w:val="000000" w:themeColor="text1"/>
-          <w:highlight w:val="lightGray"/>
-        </w:rPr>
-        <w:t>(b + 1) / r)</w:t>
-      </w:r>
-      <w:r>
-        <w:rPr>
-          <w:rFonts w:ascii="CourierNewPSMT" w:cs="CourierNewPSMT" w:hint="cs"/>
-          <w:b/>
-          <w:bCs/>
-          <w:color w:val="000000" w:themeColor="text1"/>
-          <w:highlight w:val="lightGray"/>
-        </w:rPr>
-        <w:t>;</w:t>
-      </w:r>
-    </w:p>
-    <w:p>
-      <w:pPr>
-        <w:autoSpaceDE w:val="0"/>
-        <w:autoSpaceDN w:val="0"/>
-        <w:adjustRightInd w:val="0"/>
-        <w:spacing w:after="0" w:line="240" w:lineRule="auto"/>
-        <w:ind w:firstLine="720"/>
-        <w:rPr>
-          <w:rFonts w:ascii="CourierNewPSMT" w:cs="CourierNewPSMT"/>
-          <w:b/>
-          <w:bCs/>
-          <w:color w:val="000000" w:themeColor="text1"/>
-          <w:highlight w:val="lightGray"/>
-        </w:rPr>
-      </w:pPr>
-      <w:r>
-        <w:rPr>
-          <w:rFonts w:ascii="CourierNewPSMT" w:cs="CourierNewPSMT"/>
-          <w:b/>
-          <w:bCs/>
-          <w:color w:val="000000" w:themeColor="text1"/>
-          <w:highlight w:val="lightGray"/>
-        </w:rPr>
-        <w:t>}</w:t>
-      </w:r>
-    </w:p>
-    <w:p>
-      <w:pPr>
-        <w:autoSpaceDE w:val="0"/>
-        <w:autoSpaceDN w:val="0"/>
-        <w:adjustRightInd w:val="0"/>
-        <w:spacing w:after="0" w:line="240" w:lineRule="auto"/>
-        <w:ind w:firstLine="720"/>
-        <w:rPr>
-          <w:rFonts w:ascii="CourierNewPSMT" w:cs="CourierNewPSMT"/>
-          <w:b/>
-          <w:bCs/>
-          <w:color w:val="000000" w:themeColor="text1"/>
-          <w:highlight w:val="lightGray"/>
-        </w:rPr>
-      </w:pPr>
-      <w:r>
-        <w:rPr>
-          <w:rFonts w:ascii="CourierNewPSMT" w:cs="CourierNewPSMT"/>
-          <w:b/>
-          <w:bCs/>
-          <w:color w:val="000000" w:themeColor="text1"/>
-          <w:highlight w:val="lightGray"/>
-        </w:rPr>
-        <w:t>return = b</w:t>
-      </w:r>
-      <w:r>
-        <w:rPr>
-          <w:rFonts w:ascii="CourierNewPSMT" w:cs="CourierNewPSMT" w:hint="cs"/>
-          <w:b/>
-          <w:bCs/>
-          <w:color w:val="000000" w:themeColor="text1"/>
-          <w:highlight w:val="lightGray"/>
-        </w:rPr>
-        <w:t>;</w:t>
-      </w:r>
-    </w:p>
-    <w:p>
-      <w:pPr>
-        <w:pBdr>
-          <w:bottom w:val="single" w:sz="12" w:space="1" w:color="auto"/>
-        </w:pBdr>
-        <w:rPr>
-          <w:b/>
-          <w:bCs/>
-          <w:color w:val="000000" w:themeColor="text1"/>
-        </w:rPr>
-      </w:pPr>
-      <w:r>
-        <w:rPr>
-          <w:rFonts w:ascii="CourierNewPSMT" w:cs="CourierNewPSMT"/>
-          <w:b/>
-          <w:bCs/>
-          <w:color w:val="000000" w:themeColor="text1"/>
-          <w:highlight w:val="lightGray"/>
-        </w:rPr>
-        <w:t>}</w:t>
-      </w:r>
-    </w:p>
-    <w:p/>
-    <w:p/>
-    <w:p>
-      <w:pPr>
-        <w:jc w:val="both"/>
-        <w:rPr>
-          <w:rFonts w:cstheme="minorHAnsi"/>
-        </w:rPr>
-      </w:pPr>
-    </w:p>
-    <w:p>
-      <w:pPr>
-        <w:jc w:val="both"/>
-        <w:rPr>
-          <w:rFonts w:cstheme="minorHAnsi"/>
-        </w:rPr>
-      </w:pPr>
-    </w:p>
-    <w:p>
-      <w:pPr>
-        <w:jc w:val="both"/>
-        <w:rPr>
-          <w:rFonts w:cstheme="minorHAnsi"/>
-        </w:rPr>
-      </w:pPr>
-    </w:p>
-    <w:p>
-      <w:pPr>
-        <w:jc w:val="both"/>
-        <w:rPr>
-          <w:rFonts w:cstheme="minorHAnsi"/>
-        </w:rPr>
+      <w:r>
+        <w:t xml:space="preserve"> than the number of </w:t>
+      </w:r>
+      <w:r>
+        <w:t>sites in the cluster.</w:t>
+      </w:r>
+    </w:p>
+    <w:p>
+      <w:pPr>
+        <w:jc w:val="both"/>
+      </w:pPr>
+      <w:r>
+        <w:t>The assignment of shards to sites can also be done on-the-fly.</w:t>
+      </w:r>
+    </w:p>
+    <w:p>
+      <w:pPr>
+        <w:jc w:val="both"/>
+      </w:pPr>
+      <w:r>
+        <w:t>Cons:</w:t>
+      </w:r>
+    </w:p>
+    <w:p>
+      <w:pPr>
+        <w:jc w:val="both"/>
+      </w:pPr>
+      <w:r>
+        <w:t>Performing range queries could be inefficient. Examples of range queries are finding rows greater than a lower bound or less than an upper bound (as opposed to point lookups).</w:t>
+      </w:r>
+    </w:p>
+    <w:p>
+      <w:pPr>
+        <w:jc w:val="both"/>
+      </w:pPr>
+      <w:r>
+        <w:t>Although hashed sharding results in even data distribution among physical shards, it does not separate the database based on the meaning of the information.</w:t>
+      </w:r>
+    </w:p>
+    <w:p>
+      <w:pPr>
+        <w:jc w:val="both"/>
       </w:pPr>
     </w:p>
     <w:p>
@@ -8027,6 +8224,18 @@
       <w:lang w:eastAsia="en-GB"/>
     </w:rPr>
   </w:style>
+  <w:style w:type="character" w:styleId="Hyperlink">
+    <w:name w:val="Hyperlink"/>
+    <w:basedOn w:val="DefaultParagraphFont"/>
+    <w:uiPriority w:val="99"/>
+    <w:semiHidden/>
+    <w:unhideWhenUsed/>
+    <w:rsid w:val="00766799"/>
+    <w:rPr>
+      <w:color w:val="0000FF"/>
+      <w:u w:val="single"/>
+    </w:rPr>
+  </w:style>
 </w:styles>
 </file>
 

</xml_diff>